<commit_message>
Bigger section headings in the Word listing so it scans printed
Co-authored-by: arena-agent <297053741+arena-agent@users.noreply.github.com>
</commit_message>
<xml_diff>
--- a/TaskPe-App-Listing.docx
+++ b/TaskPe-App-Listing.docx
@@ -302,7 +302,7 @@
         <w:rPr>
           <w:b/>
           <w:color w:val="0B5C57"/>
-          <w:sz w:val="24"/>
+          <w:sz w:val="26"/>
         </w:rPr>
         <w:t>1. Choose a primary listing language</w:t>
       </w:r>
@@ -709,7 +709,7 @@
         <w:rPr>
           <w:b/>
           <w:color w:val="0B5C57"/>
-          <w:sz w:val="24"/>
+          <w:sz w:val="26"/>
         </w:rPr>
         <w:t>2. Listing copy</w:t>
       </w:r>
@@ -1132,7 +1132,7 @@
         <w:rPr>
           <w:b/>
           <w:color w:val="0B5C57"/>
-          <w:sz w:val="22"/>
+          <w:sz w:val="23"/>
         </w:rPr>
         <w:t>Feature list (≤80 characters each)</w:t>
       </w:r>
@@ -1218,7 +1218,7 @@
         <w:rPr>
           <w:b/>
           <w:color w:val="0B5C57"/>
-          <w:sz w:val="22"/>
+          <w:sz w:val="23"/>
         </w:rPr>
         <w:t>Integrations (≤6 — not Shopify itself, and only real integrations)</w:t>
       </w:r>
@@ -1266,7 +1266,7 @@
         <w:rPr>
           <w:b/>
           <w:color w:val="0B5C57"/>
-          <w:sz w:val="22"/>
+          <w:sz w:val="23"/>
         </w:rPr>
         <w:t>Search terms (≤5, complete words, one idea each)</w:t>
       </w:r>
@@ -1345,7 +1345,7 @@
         <w:rPr>
           <w:b/>
           <w:color w:val="0B5C57"/>
-          <w:sz w:val="22"/>
+          <w:sz w:val="23"/>
         </w:rPr>
         <w:t>Categories and tags</w:t>
       </w:r>
@@ -1645,7 +1645,7 @@
         <w:rPr>
           <w:b/>
           <w:color w:val="0B5C57"/>
-          <w:sz w:val="22"/>
+          <w:sz w:val="23"/>
         </w:rPr>
         <w:t>Pricing section</w:t>
       </w:r>
@@ -2127,7 +2127,7 @@
         <w:rPr>
           <w:b/>
           <w:color w:val="0B5C57"/>
-          <w:sz w:val="22"/>
+          <w:sz w:val="23"/>
         </w:rPr>
         <w:t>Links, support and eligibility</w:t>
       </w:r>
@@ -2617,7 +2617,7 @@
         <w:rPr>
           <w:b/>
           <w:color w:val="0B5C57"/>
-          <w:sz w:val="24"/>
+          <w:sz w:val="26"/>
         </w:rPr>
         <w:t>3. Media: files, spec and alt text</w:t>
       </w:r>
@@ -3256,7 +3256,7 @@
         <w:rPr>
           <w:b/>
           <w:color w:val="0B5C57"/>
-          <w:sz w:val="22"/>
+          <w:sz w:val="23"/>
         </w:rPr>
         <w:t>Alt text — one per image, two lengths</w:t>
       </w:r>
@@ -3816,7 +3816,7 @@
         <w:rPr>
           <w:b/>
           <w:color w:val="0B5C57"/>
-          <w:sz w:val="24"/>
+          <w:sz w:val="26"/>
         </w:rPr>
         <w:t>4. API access requests → Protected customer data</w:t>
       </w:r>
@@ -4139,7 +4139,7 @@
         <w:rPr>
           <w:b/>
           <w:color w:val="0B5C57"/>
-          <w:sz w:val="22"/>
+          <w:sz w:val="23"/>
         </w:rPr>
         <w:t>The one decision to make before you paste</w:t>
       </w:r>
@@ -4647,7 +4647,7 @@
         <w:rPr>
           <w:b/>
           <w:color w:val="0B5C57"/>
-          <w:sz w:val="22"/>
+          <w:sz w:val="23"/>
         </w:rPr>
         <w:t>Reason A — paste into the “Protected customer data” reason box</w:t>
       </w:r>
@@ -4991,7 +4991,7 @@
         <w:rPr>
           <w:b/>
           <w:color w:val="0B5C57"/>
-          <w:sz w:val="22"/>
+          <w:sz w:val="23"/>
         </w:rPr>
         <w:t>Reason B — only if you keep the customer tab (Name field)</w:t>
       </w:r>
@@ -5031,7 +5031,7 @@
         <w:rPr>
           <w:b/>
           <w:color w:val="0B5C57"/>
-          <w:sz w:val="22"/>
+          <w:sz w:val="23"/>
         </w:rPr>
         <w:t>Scope-by-scope justification (same facts, per scope — some forms ask for one reason per scope)</w:t>
       </w:r>
@@ -5352,7 +5352,7 @@
         <w:rPr>
           <w:b/>
           <w:color w:val="0B5C57"/>
-          <w:sz w:val="24"/>
+          <w:sz w:val="26"/>
         </w:rPr>
         <w:t>5. Data protection details — answer per requirement</w:t>
       </w:r>
@@ -5745,7 +5745,7 @@
         <w:rPr>
           <w:b/>
           <w:color w:val="0B5C57"/>
-          <w:sz w:val="24"/>
+          <w:sz w:val="26"/>
         </w:rPr>
         <w:t xml:space="preserve">6. </w:t>
       </w:r>
@@ -5754,7 +5754,7 @@
           <w:rFonts w:ascii="Consolas" w:hAnsi="Consolas"/>
           <w:b/>
           <w:color w:val="0B5C57"/>
-          <w:sz w:val="23"/>
+          <w:sz w:val="25"/>
         </w:rPr>
         <w:t>read_all_orders</w:t>
       </w:r>
@@ -5762,7 +5762,7 @@
         <w:rPr>
           <w:b/>
           <w:color w:val="0B5C57"/>
-          <w:sz w:val="24"/>
+          <w:sz w:val="26"/>
         </w:rPr>
         <w:t xml:space="preserve"> — “describe your app and why you're applying for access”</w:t>
       </w:r>
@@ -5944,7 +5944,7 @@
         <w:rPr>
           <w:b/>
           <w:color w:val="0B5C57"/>
-          <w:sz w:val="24"/>
+          <w:sz w:val="26"/>
         </w:rPr>
         <w:t>7. App review instructions (4.5) — paste as-is</w:t>
       </w:r>
@@ -6204,7 +6204,7 @@
         <w:rPr>
           <w:b/>
           <w:color w:val="0B5C57"/>
-          <w:sz w:val="24"/>
+          <w:sz w:val="26"/>
         </w:rPr>
         <w:t>8. Rejection radar (read this before you press submit)</w:t>
       </w:r>
@@ -6719,7 +6719,7 @@
         <w:rPr>
           <w:b/>
           <w:color w:val="0B5C57"/>
-          <w:sz w:val="24"/>
+          <w:sz w:val="26"/>
         </w:rPr>
         <w:t>9. Field-length report (generated — regenerate after any copy edit)</w:t>
       </w:r>
@@ -8346,7 +8346,7 @@
         <w:rPr>
           <w:b/>
           <w:color w:val="0B5C57"/>
-          <w:sz w:val="22"/>
+          <w:sz w:val="23"/>
         </w:rPr>
         <w:t>Still to fill before submitting</w:t>
       </w:r>

</xml_diff>